<commit_message>
docs: update manuals + decks to v1.2 (PMBOK 6 = 4th framework)
Brings the Architecture, User and Operation manuals (and summary decks) current
with PMBOK 6th ed as the fourth live framework behind apps.p3mai.com/pmbok.

- DOC-01: four-framework framing; new §6.4 on the container-vs-hub swimlane grid
  (config.lifecycle_layer="hub") that renders PMBOK's 5×10 process matrix;
  provenance row (build_pmbok.py, 187/400) + pmbok-method-map service; roadmap.
- DOC-02: four-methods framing; /pmbok address; new §12.3 on the PMBOK map (KA×PG
  grid, Inputs&Outputs/Tools layers, I/O/T codes, curated-indicative ITTO note).
- DOC-03: pmbok-method-map service + /pmbok route + build_pmbok in the seed/
  builder steps; four-service summary.
- docstyle "Applies to", README + doc-control rows bumped to v1.2. Regenerated
  all 3 .docx + 3 .pptx.

Co-Authored-By: Claude Opus 4.8 <noreply@anthropic.com>
</commit_message>
<xml_diff>
--- a/docs/01_Architecture_and_Design.docx
+++ b/docs/01_Architecture_and_Design.docx
@@ -165,7 +165,7 @@
                 <w:color w:val="1C2B3A"/>
                 <w:sz w:val="22"/>
               </w:rPr>
-              <w:t>v1.1</w:t>
+              <w:t>v1.2</w:t>
             </w:r>
           </w:p>
         </w:tc>
@@ -309,7 +309,7 @@
                 <w:color w:val="1C2B3A"/>
                 <w:sz w:val="22"/>
               </w:rPr>
-              <w:t>P3MAI Method Map (PRINCE2 7 · MSP 5th ed · SAFe 6.0 Essential)</w:t>
+              <w:t>P3MAI Method Map (PRINCE2 7 · MSP 5th ed · SAFe 6.0 Essential · PMBOK 6th ed)</w:t>
             </w:r>
           </w:p>
         </w:tc>
@@ -562,6 +562,76 @@
           </w:p>
         </w:tc>
       </w:tr>
+      <w:tr>
+        <w:tc>
+          <w:tcPr>
+            <w:tcW w:type="dxa" w:w="2353"/>
+          </w:tcPr>
+          <w:p>
+            <w:r>
+              <w:rPr>
+                <w:rFonts w:ascii="Segoe UI" w:hAnsi="Segoe UI" w:cs="Segoe UI"/>
+                <w:b w:val="0"/>
+                <w:i w:val="0"/>
+                <w:color w:val="1C2B3A"/>
+                <w:sz w:val="20"/>
+              </w:rPr>
+              <w:t>v1.2</w:t>
+            </w:r>
+          </w:p>
+        </w:tc>
+        <w:tc>
+          <w:tcPr>
+            <w:tcW w:type="dxa" w:w="2353"/>
+          </w:tcPr>
+          <w:p>
+            <w:r>
+              <w:rPr>
+                <w:rFonts w:ascii="Segoe UI" w:hAnsi="Segoe UI" w:cs="Segoe UI"/>
+                <w:b w:val="0"/>
+                <w:i w:val="0"/>
+                <w:color w:val="1C2B3A"/>
+                <w:sz w:val="20"/>
+              </w:rPr>
+              <w:t>2026-08-02</w:t>
+            </w:r>
+          </w:p>
+        </w:tc>
+        <w:tc>
+          <w:tcPr>
+            <w:tcW w:type="dxa" w:w="2353"/>
+          </w:tcPr>
+          <w:p>
+            <w:r>
+              <w:rPr>
+                <w:rFonts w:ascii="Segoe UI" w:hAnsi="Segoe UI" w:cs="Segoe UI"/>
+                <w:b w:val="0"/>
+                <w:i w:val="0"/>
+                <w:color w:val="1C2B3A"/>
+                <w:sz w:val="20"/>
+              </w:rPr>
+              <w:t>Douglas Colvin</w:t>
+            </w:r>
+          </w:p>
+        </w:tc>
+        <w:tc>
+          <w:tcPr>
+            <w:tcW w:type="dxa" w:w="2353"/>
+          </w:tcPr>
+          <w:p>
+            <w:r>
+              <w:rPr>
+                <w:rFonts w:ascii="Segoe UI" w:hAnsi="Segoe UI" w:cs="Segoe UI"/>
+                <w:b w:val="0"/>
+                <w:i w:val="0"/>
+                <w:color w:val="1C2B3A"/>
+                <w:sz w:val="20"/>
+              </w:rPr>
+              <w:t>PMBOK 6th ed added as the fourth framework; the hub-layer grid (config lifecycle_layer='hub') that renders PMBOK's 5×10 process matrix; four-service deployment.</w:t>
+            </w:r>
+          </w:p>
+        </w:tc>
+      </w:tr>
     </w:tbl>
     <w:p/>
     <w:p>
@@ -661,7 +731,7 @@
           <w:color w:val="1C2B3A"/>
           <w:sz w:val="22"/>
         </w:rPr>
-        <w:t>three frameworks</w:t>
+        <w:t>four frameworks</w:t>
       </w:r>
       <w:r>
         <w:rPr>
@@ -711,7 +781,7 @@
           <w:color w:val="1C2B3A"/>
           <w:sz w:val="22"/>
         </w:rPr>
-        <w:t xml:space="preserve"> (7 programme processes) and </w:t>
+        <w:t xml:space="preserve"> (7 programme processes), </w:t>
       </w:r>
       <w:r>
         <w:rPr>
@@ -731,7 +801,27 @@
           <w:color w:val="1C2B3A"/>
           <w:sz w:val="22"/>
         </w:rPr>
-        <w:t xml:space="preserve"> (the Agile Release Train and Team events across the PI cadence) — each cross-referencing its management activities to the roles, artefacts, practices and principles that surround them.</w:t>
+        <w:t xml:space="preserve"> (the Agile Release Train and Team events across the PI cadence) and </w:t>
+      </w:r>
+      <w:r>
+        <w:rPr>
+          <w:rFonts w:ascii="Segoe UI" w:hAnsi="Segoe UI" w:cs="Segoe UI"/>
+          <w:b/>
+          <w:i w:val="0"/>
+          <w:color w:val="1C2B3A"/>
+          <w:sz w:val="22"/>
+        </w:rPr>
+        <w:t>PMBOK 6th edition</w:t>
+      </w:r>
+      <w:r>
+        <w:rPr>
+          <w:rFonts w:ascii="Segoe UI" w:hAnsi="Segoe UI" w:cs="Segoe UI"/>
+          <w:b w:val="0"/>
+          <w:i w:val="0"/>
+          <w:color w:val="1C2B3A"/>
+          <w:sz w:val="22"/>
+        </w:rPr>
+        <w:t xml:space="preserve"> (the 49 processes in the classic 5 Process Groups × 10 Knowledge Areas matrix) — each cross-referencing its management activities to the roles, artefacts, practices and principles that surround them.</w:t>
       </w:r>
     </w:p>
     <w:p>
@@ -853,7 +943,7 @@
           <w:color w:val="1C2B3A"/>
           <w:sz w:val="22"/>
         </w:rPr>
-        <w:t>no code changes</w:t>
+        <w:t>almost no code changes</w:t>
       </w:r>
       <w:r>
         <w:rPr>
@@ -863,7 +953,7 @@
           <w:color w:val="1C2B3A"/>
           <w:sz w:val="22"/>
         </w:rPr>
-        <w:t xml:space="preserve">. This has now been proven across three structurally different frameworks. Each framework is deployed as its own Docker container on Render (selected by the </w:t>
+        <w:t xml:space="preserve">. This has now been proven across four structurally different frameworks (PMBOK's 5×10 process matrix needed only a small, opt-in grid-rendering flag — see §6.4). Each framework is deployed as its own Docker container on Render (selected by the </w:t>
       </w:r>
       <w:r>
         <w:rPr>
@@ -883,7 +973,7 @@
           <w:color w:val="1C2B3A"/>
           <w:sz w:val="22"/>
         </w:rPr>
-        <w:t xml:space="preserve"> env var) and all three are served behind the shared front door </w:t>
+        <w:t xml:space="preserve"> env var) and all four are served behind the shared front door </w:t>
       </w:r>
       <w:r>
         <w:rPr>
@@ -943,6 +1033,26 @@
           <w:color w:val="1C2B3A"/>
           <w:sz w:val="22"/>
         </w:rPr>
+        <w:t xml:space="preserve">, </w:t>
+      </w:r>
+      <w:r>
+        <w:rPr>
+          <w:rFonts w:ascii="Consolas" w:hAnsi="Consolas" w:cs="Consolas"/>
+          <w:b w:val="0"/>
+          <w:i w:val="0"/>
+          <w:color w:val="1B3F6E"/>
+          <w:sz w:val="21"/>
+        </w:rPr>
+        <w:t>/safe</w:t>
+      </w:r>
+      <w:r>
+        <w:rPr>
+          <w:rFonts w:ascii="Segoe UI" w:hAnsi="Segoe UI" w:cs="Segoe UI"/>
+          <w:b w:val="0"/>
+          <w:i w:val="0"/>
+          <w:color w:val="1C2B3A"/>
+          <w:sz w:val="22"/>
+        </w:rPr>
         <w:t xml:space="preserve"> and </w:t>
       </w:r>
       <w:r>
@@ -953,7 +1063,7 @@
           <w:color w:val="1B3F6E"/>
           <w:sz w:val="21"/>
         </w:rPr>
-        <w:t>/safe</w:t>
+        <w:t>/pmbok</w:t>
       </w:r>
       <w:r>
         <w:rPr>
@@ -4318,6 +4428,234 @@
     <w:p/>
     <w:p>
       <w:pPr>
+        <w:pStyle w:val="Heading2"/>
+        <w:spacing w:before="200" w:after="80"/>
+      </w:pPr>
+      <w:r>
+        <w:rPr>
+          <w:rFonts w:ascii="Segoe UI Semibold" w:hAnsi="Segoe UI Semibold" w:cs="Segoe UI Semibold"/>
+          <w:b/>
+          <w:i w:val="0"/>
+          <w:color w:val="1B3F6E"/>
+          <w:sz w:val="26"/>
+        </w:rPr>
+        <w:t>6.4  Which layer fills the swimlane grid (container vs hub)</w:t>
+      </w:r>
+    </w:p>
+    <w:p>
+      <w:r>
+        <w:rPr>
+          <w:rFonts w:ascii="Segoe UI" w:hAnsi="Segoe UI" w:cs="Segoe UI"/>
+          <w:b w:val="0"/>
+          <w:i w:val="0"/>
+          <w:color w:val="1C2B3A"/>
+          <w:sz w:val="22"/>
+        </w:rPr>
+        <w:t xml:space="preserve">The Lifecycle view lays entities out in a grid of swimlane </w:t>
+      </w:r>
+      <w:r>
+        <w:rPr>
+          <w:rFonts w:ascii="Segoe UI" w:hAnsi="Segoe UI" w:cs="Segoe UI"/>
+          <w:b/>
+          <w:i w:val="0"/>
+          <w:color w:val="1C2B3A"/>
+          <w:sz w:val="22"/>
+        </w:rPr>
+        <w:t>rows</w:t>
+      </w:r>
+      <w:r>
+        <w:rPr>
+          <w:rFonts w:ascii="Segoe UI" w:hAnsi="Segoe UI" w:cs="Segoe UI"/>
+          <w:b w:val="0"/>
+          <w:i w:val="0"/>
+          <w:color w:val="1C2B3A"/>
+          <w:sz w:val="22"/>
+        </w:rPr>
+        <w:t xml:space="preserve"> (config </w:t>
+      </w:r>
+      <w:r>
+        <w:rPr>
+          <w:rFonts w:ascii="Consolas" w:hAnsi="Consolas" w:cs="Consolas"/>
+          <w:b w:val="0"/>
+          <w:i w:val="0"/>
+          <w:color w:val="1B3F6E"/>
+          <w:sz w:val="21"/>
+        </w:rPr>
+        <w:t>lanes</w:t>
+      </w:r>
+      <w:r>
+        <w:rPr>
+          <w:rFonts w:ascii="Segoe UI" w:hAnsi="Segoe UI" w:cs="Segoe UI"/>
+          <w:b w:val="0"/>
+          <w:i w:val="0"/>
+          <w:color w:val="1C2B3A"/>
+          <w:sz w:val="22"/>
+        </w:rPr>
+        <w:t xml:space="preserve">) × timeline </w:t>
+      </w:r>
+      <w:r>
+        <w:rPr>
+          <w:rFonts w:ascii="Segoe UI" w:hAnsi="Segoe UI" w:cs="Segoe UI"/>
+          <w:b/>
+          <w:i w:val="0"/>
+          <w:color w:val="1C2B3A"/>
+          <w:sz w:val="22"/>
+        </w:rPr>
+        <w:t>columns</w:t>
+      </w:r>
+      <w:r>
+        <w:rPr>
+          <w:rFonts w:ascii="Segoe UI" w:hAnsi="Segoe UI" w:cs="Segoe UI"/>
+          <w:b w:val="0"/>
+          <w:i w:val="0"/>
+          <w:color w:val="1C2B3A"/>
+          <w:sz w:val="22"/>
+        </w:rPr>
+        <w:t xml:space="preserve"> (config </w:t>
+      </w:r>
+      <w:r>
+        <w:rPr>
+          <w:rFonts w:ascii="Consolas" w:hAnsi="Consolas" w:cs="Consolas"/>
+          <w:b w:val="0"/>
+          <w:i w:val="0"/>
+          <w:color w:val="1B3F6E"/>
+          <w:sz w:val="21"/>
+        </w:rPr>
+        <w:t>phases</w:t>
+      </w:r>
+      <w:r>
+        <w:rPr>
+          <w:rFonts w:ascii="Segoe UI" w:hAnsi="Segoe UI" w:cs="Segoe UI"/>
+          <w:b w:val="0"/>
+          <w:i w:val="0"/>
+          <w:color w:val="1C2B3A"/>
+          <w:sz w:val="22"/>
+        </w:rPr>
+        <w:t xml:space="preserve">). By default the </w:t>
+      </w:r>
+      <w:r>
+        <w:rPr>
+          <w:rFonts w:ascii="Segoe UI" w:hAnsi="Segoe UI" w:cs="Segoe UI"/>
+          <w:b/>
+          <w:i w:val="0"/>
+          <w:color w:val="1C2B3A"/>
+          <w:sz w:val="22"/>
+        </w:rPr>
+        <w:t>container</w:t>
+      </w:r>
+      <w:r>
+        <w:rPr>
+          <w:rFonts w:ascii="Segoe UI" w:hAnsi="Segoe UI" w:cs="Segoe UI"/>
+          <w:b w:val="0"/>
+          <w:i w:val="0"/>
+          <w:color w:val="1C2B3A"/>
+          <w:sz w:val="22"/>
+        </w:rPr>
+        <w:t xml:space="preserve"> layer fills the cells (PRINCE2 processes, MSP programme processes, SAFe events), with its child hubs listed beneath. PMBOK is different: its identity *is* a two-axis matrix — 10 Knowledge Areas (rows) × 5 Process Groups (columns) — and the 49 </w:t>
+      </w:r>
+      <w:r>
+        <w:rPr>
+          <w:rFonts w:ascii="Segoe UI" w:hAnsi="Segoe UI" w:cs="Segoe UI"/>
+          <w:b/>
+          <w:i w:val="0"/>
+          <w:color w:val="1C2B3A"/>
+          <w:sz w:val="22"/>
+        </w:rPr>
+        <w:t>processes</w:t>
+      </w:r>
+      <w:r>
+        <w:rPr>
+          <w:rFonts w:ascii="Segoe UI" w:hAnsi="Segoe UI" w:cs="Segoe UI"/>
+          <w:b w:val="0"/>
+          <w:i w:val="0"/>
+          <w:color w:val="1C2B3A"/>
+          <w:sz w:val="22"/>
+        </w:rPr>
+        <w:t xml:space="preserve"> (the hub layer, which carries the cross-references) are what belong in the cells. A framework sets </w:t>
+      </w:r>
+      <w:r>
+        <w:rPr>
+          <w:rFonts w:ascii="Consolas" w:hAnsi="Consolas" w:cs="Consolas"/>
+          <w:b w:val="0"/>
+          <w:i w:val="0"/>
+          <w:color w:val="1B3F6E"/>
+          <w:sz w:val="21"/>
+        </w:rPr>
+        <w:t>config.lifecycle_layer = "hub"</w:t>
+      </w:r>
+      <w:r>
+        <w:rPr>
+          <w:rFonts w:ascii="Segoe UI" w:hAnsi="Segoe UI" w:cs="Segoe UI"/>
+          <w:b w:val="0"/>
+          <w:i w:val="0"/>
+          <w:color w:val="1C2B3A"/>
+          <w:sz w:val="22"/>
+        </w:rPr>
+        <w:t xml:space="preserve"> to grid the hub layer directly: each hub self-places by its own </w:t>
+      </w:r>
+      <w:r>
+        <w:rPr>
+          <w:rFonts w:ascii="Consolas" w:hAnsi="Consolas" w:cs="Consolas"/>
+          <w:b w:val="0"/>
+          <w:i w:val="0"/>
+          <w:color w:val="1B3F6E"/>
+          <w:sz w:val="21"/>
+        </w:rPr>
+        <w:t>lifecycle_level</w:t>
+      </w:r>
+      <w:r>
+        <w:rPr>
+          <w:rFonts w:ascii="Segoe UI" w:hAnsi="Segoe UI" w:cs="Segoe UI"/>
+          <w:b w:val="0"/>
+          <w:i w:val="0"/>
+          <w:color w:val="1C2B3A"/>
+          <w:sz w:val="22"/>
+        </w:rPr>
+        <w:t xml:space="preserve"> (row) and </w:t>
+      </w:r>
+      <w:r>
+        <w:rPr>
+          <w:rFonts w:ascii="Consolas" w:hAnsi="Consolas" w:cs="Consolas"/>
+          <w:b w:val="0"/>
+          <w:i w:val="0"/>
+          <w:color w:val="1B3F6E"/>
+          <w:sz w:val="21"/>
+        </w:rPr>
+        <w:t>lifecycle_phase</w:t>
+      </w:r>
+      <w:r>
+        <w:rPr>
+          <w:rFonts w:ascii="Segoe UI" w:hAnsi="Segoe UI" w:cs="Segoe UI"/>
+          <w:b w:val="0"/>
+          <w:i w:val="0"/>
+          <w:color w:val="1C2B3A"/>
+          <w:sz w:val="22"/>
+        </w:rPr>
+        <w:t xml:space="preserve"> (column). This is the one small, </w:t>
+      </w:r>
+      <w:r>
+        <w:rPr>
+          <w:rFonts w:ascii="Segoe UI" w:hAnsi="Segoe UI" w:cs="Segoe UI"/>
+          <w:b/>
+          <w:i w:val="0"/>
+          <w:color w:val="1C2B3A"/>
+          <w:sz w:val="22"/>
+        </w:rPr>
+        <w:t>opt-in</w:t>
+      </w:r>
+      <w:r>
+        <w:rPr>
+          <w:rFonts w:ascii="Segoe UI" w:hAnsi="Segoe UI" w:cs="Segoe UI"/>
+          <w:b w:val="0"/>
+          <w:i w:val="0"/>
+          <w:color w:val="1C2B3A"/>
+          <w:sz w:val="22"/>
+        </w:rPr>
+        <w:t xml:space="preserve"> rendering addition PMBOK needed; every other framework is unaffected (the default remains the container layer).</w:t>
+      </w:r>
+    </w:p>
+    <w:p>
+      <w:pPr>
         <w:pStyle w:val="Heading1"/>
         <w:spacing w:before="280" w:after="80"/>
       </w:pPr>
@@ -6214,6 +6552,80 @@
           </w:p>
         </w:tc>
       </w:tr>
+      <w:tr>
+        <w:tc>
+          <w:tcPr>
+            <w:tcW w:type="dxa" w:w="1928"/>
+            <w:shd w:val="clear" w:fill="F3F6FA"/>
+          </w:tcPr>
+          <w:p>
+            <w:r>
+              <w:rPr>
+                <w:rFonts w:ascii="Segoe UI" w:hAnsi="Segoe UI" w:cs="Segoe UI"/>
+                <w:b w:val="0"/>
+                <w:i w:val="0"/>
+                <w:color w:val="1C2B3A"/>
+                <w:sz w:val="19"/>
+              </w:rPr>
+              <w:t>PMBOK 6th ed</w:t>
+            </w:r>
+          </w:p>
+        </w:tc>
+        <w:tc>
+          <w:tcPr>
+            <w:tcW w:type="dxa" w:w="2041"/>
+            <w:shd w:val="clear" w:fill="F3F6FA"/>
+          </w:tcPr>
+          <w:p>
+            <w:r>
+              <w:rPr>
+                <w:rFonts w:ascii="Segoe UI" w:hAnsi="Segoe UI" w:cs="Segoe UI"/>
+                <w:b w:val="0"/>
+                <w:i w:val="0"/>
+                <w:color w:val="1C2B3A"/>
+                <w:sz w:val="19"/>
+              </w:rPr>
+              <w:t>pmbok-6.json</w:t>
+            </w:r>
+          </w:p>
+        </w:tc>
+        <w:tc>
+          <w:tcPr>
+            <w:tcW w:type="dxa" w:w="3685"/>
+            <w:shd w:val="clear" w:fill="F3F6FA"/>
+          </w:tcPr>
+          <w:p>
+            <w:r>
+              <w:rPr>
+                <w:rFonts w:ascii="Segoe UI" w:hAnsi="Segoe UI" w:cs="Segoe UI"/>
+                <w:b w:val="0"/>
+                <w:i w:val="0"/>
+                <w:color w:val="1C2B3A"/>
+                <w:sz w:val="19"/>
+              </w:rPr>
+              <w:t>build_pmbok.py (inline data; the 5×10 grid + ITTOs)</w:t>
+            </w:r>
+          </w:p>
+        </w:tc>
+        <w:tc>
+          <w:tcPr>
+            <w:tcW w:type="dxa" w:w="1134"/>
+            <w:shd w:val="clear" w:fill="F3F6FA"/>
+          </w:tcPr>
+          <w:p>
+            <w:r>
+              <w:rPr>
+                <w:rFonts w:ascii="Segoe UI" w:hAnsi="Segoe UI" w:cs="Segoe UI"/>
+                <w:b w:val="0"/>
+                <w:i w:val="0"/>
+                <w:color w:val="1C2B3A"/>
+                <w:sz w:val="19"/>
+              </w:rPr>
+              <w:t>187 / 400</w:t>
+            </w:r>
+          </w:p>
+        </w:tc>
+      </w:tr>
     </w:tbl>
     <w:p/>
     <w:tbl>
@@ -6254,7 +6666,7 @@
                 <w:color w:val="1C2B3A"/>
                 <w:sz w:val="20"/>
               </w:rPr>
-              <w:t xml:space="preserve">Across all three frameworks, the framework </w:t>
+              <w:t xml:space="preserve">Across all four frameworks, the framework </w:t>
             </w:r>
             <w:r>
               <w:rPr>
@@ -6274,7 +6686,7 @@
                 <w:color w:val="1C2B3A"/>
                 <w:sz w:val="20"/>
               </w:rPr>
-              <w:t xml:space="preserve"> (process/event, role, practice/competency, product/artefact, principle </w:t>
+              <w:t xml:space="preserve"> (process/event, role, practice/competency/knowledge-area, product/artefact, principle </w:t>
             </w:r>
             <w:r>
               <w:rPr>
@@ -6294,7 +6706,7 @@
                 <w:color w:val="1C2B3A"/>
                 <w:sz w:val="20"/>
               </w:rPr>
-              <w:t xml:space="preserve">) is corroborated from public sources and marked *confirmed*. The </w:t>
+              <w:t xml:space="preserve">, and PMBOK's process-matrix placement) is corroborated from public sources and marked *confirmed*. The </w:t>
             </w:r>
             <w:r>
               <w:rPr>
@@ -6304,7 +6716,7 @@
                 <w:color w:val="1C2B3A"/>
                 <w:sz w:val="20"/>
               </w:rPr>
-              <w:t>activity breakdown and every cross-reference mark</w:t>
+              <w:t>activity breakdown / ITTO cross-references and every mark</w:t>
             </w:r>
             <w:r>
               <w:rPr>
@@ -6314,7 +6726,7 @@
                 <w:color w:val="1C2B3A"/>
                 <w:sz w:val="20"/>
               </w:rPr>
-              <w:t xml:space="preserve"> are a best-effort reconstruction, marked *indicative* (shown with a dashed ring). SME-verify against the licensed manual / body of knowledge before any formal use. SAFe® is a trademark of Scaled Agile, Inc.; the map is an independent reference tool, not affiliated with or endorsed by Scaled Agile, Inc.</w:t>
+              <w:t xml:space="preserve"> are a best-effort reconstruction, marked *indicative* (shown with a dashed ring). SME-verify against the licensed manual / body of knowledge before any formal use. SAFe® is a trademark of Scaled Agile, Inc.; PMBOK, PMI and PMP are marks of the Project Management Institute, Inc. The map is an independent reference tool, not affiliated with or endorsed by either.</w:t>
             </w:r>
           </w:p>
         </w:tc>
@@ -6918,6 +7330,80 @@
                 <w:sz w:val="19"/>
               </w:rPr>
               <w:t>apps.p3mai.com/safe</w:t>
+            </w:r>
+          </w:p>
+        </w:tc>
+      </w:tr>
+      <w:tr>
+        <w:tc>
+          <w:tcPr>
+            <w:tcW w:type="dxa" w:w="2041"/>
+            <w:shd w:val="clear" w:fill="F3F6FA"/>
+          </w:tcPr>
+          <w:p>
+            <w:r>
+              <w:rPr>
+                <w:rFonts w:ascii="Segoe UI" w:hAnsi="Segoe UI" w:cs="Segoe UI"/>
+                <w:b w:val="0"/>
+                <w:i w:val="0"/>
+                <w:color w:val="1C2B3A"/>
+                <w:sz w:val="19"/>
+              </w:rPr>
+              <w:t>pmbok-method-map</w:t>
+            </w:r>
+          </w:p>
+        </w:tc>
+        <w:tc>
+          <w:tcPr>
+            <w:tcW w:type="dxa" w:w="1814"/>
+            <w:shd w:val="clear" w:fill="F3F6FA"/>
+          </w:tcPr>
+          <w:p>
+            <w:r>
+              <w:rPr>
+                <w:rFonts w:ascii="Segoe UI" w:hAnsi="Segoe UI" w:cs="Segoe UI"/>
+                <w:b w:val="0"/>
+                <w:i w:val="0"/>
+                <w:color w:val="1C2B3A"/>
+                <w:sz w:val="19"/>
+              </w:rPr>
+              <w:t>pmbok-6</w:t>
+            </w:r>
+          </w:p>
+        </w:tc>
+        <w:tc>
+          <w:tcPr>
+            <w:tcW w:type="dxa" w:w="1361"/>
+            <w:shd w:val="clear" w:fill="F3F6FA"/>
+          </w:tcPr>
+          <w:p>
+            <w:r>
+              <w:rPr>
+                <w:rFonts w:ascii="Segoe UI" w:hAnsi="Segoe UI" w:cs="Segoe UI"/>
+                <w:b w:val="0"/>
+                <w:i w:val="0"/>
+                <w:color w:val="1C2B3A"/>
+                <w:sz w:val="19"/>
+              </w:rPr>
+              <w:t>/pmbok/</w:t>
+            </w:r>
+          </w:p>
+        </w:tc>
+        <w:tc>
+          <w:tcPr>
+            <w:tcW w:type="dxa" w:w="3572"/>
+            <w:shd w:val="clear" w:fill="F3F6FA"/>
+          </w:tcPr>
+          <w:p>
+            <w:r>
+              <w:rPr>
+                <w:rFonts w:ascii="Segoe UI" w:hAnsi="Segoe UI" w:cs="Segoe UI"/>
+                <w:b w:val="0"/>
+                <w:i w:val="0"/>
+                <w:color w:val="1C2B3A"/>
+                <w:sz w:val="19"/>
+              </w:rPr>
+              <w:t>apps.p3mai.com/pmbok</w:t>
             </w:r>
           </w:p>
         </w:tc>
@@ -7681,7 +8167,7 @@
           <w:color w:val="1C2B3A"/>
           <w:sz w:val="22"/>
         </w:rPr>
-        <w:t xml:space="preserve"> — MSP 5th Edition (2nd framework) and SAFe 6.0 Essential (3rd) are live behind the front door.</w:t>
+        <w:t xml:space="preserve"> — MSP 5th Edition (2nd), SAFe 6.0 Essential (3rd) and PMBOK 6th Edition (4th) are live behind the front door.</w:t>
       </w:r>
     </w:p>
     <w:p>
@@ -7696,7 +8182,7 @@
           <w:color w:val="1C2B3A"/>
           <w:sz w:val="22"/>
         </w:rPr>
-        <w:t>SME-verify the MSP and SAFe activity breakdowns and cross-reference marks (currently indicative), via authoring mode or the builder scripts.</w:t>
+        <w:t>SME-verify the MSP / SAFe activity breakdowns and the PMBOK ITTO cross-references (currently indicative), via authoring mode or the builder scripts.</w:t>
       </w:r>
     </w:p>
     <w:p>
@@ -7712,6 +8198,21 @@
           <w:sz w:val="22"/>
         </w:rPr>
         <w:t>Extend SAFe beyond Essential (Portfolio / Large Solution levels) as a larger seed.</w:t>
+      </w:r>
+    </w:p>
+    <w:p>
+      <w:pPr>
+        <w:pStyle w:val="ListBullet"/>
+      </w:pPr>
+      <w:r>
+        <w:rPr>
+          <w:rFonts w:ascii="Segoe UI" w:hAnsi="Segoe UI" w:cs="Segoe UI"/>
+          <w:b w:val="0"/>
+          <w:i w:val="0"/>
+          <w:color w:val="1C2B3A"/>
+          <w:sz w:val="22"/>
+        </w:rPr>
+        <w:t>Consider PMBOK 7th/8th edition (principles + performance domains) as a companion map.</w:t>
       </w:r>
     </w:p>
     <w:p>
@@ -7866,7 +8367,7 @@
                 <w:color w:val="1B3F6E"/>
                 <w:sz w:val="18"/>
               </w:rPr>
-              <w:t xml:space="preserve">  backend/app/seed_data/   prince2-7.json · msp-5.json · safe-essential.json</w:t>
+              <w:t xml:space="preserve">  backend/app/seed_data/   prince2-7 · msp-5 · safe-essential · pmbok-6 .json</w:t>
             </w:r>
           </w:p>
           <w:p>
@@ -7881,7 +8382,7 @@
                 <w:color w:val="1B3F6E"/>
                 <w:sz w:val="18"/>
               </w:rPr>
-              <w:t xml:space="preserve">  backend/scripts/    extract_prince2.py · build_msp.py · build_safe.py</w:t>
+              <w:t xml:space="preserve">  backend/scripts/    extract_prince2.py · build_msp/safe/pmbok.py</w:t>
             </w:r>
           </w:p>
           <w:p>
@@ -8004,7 +8505,7 @@
         <w:sz w:val="16"/>
       </w:rPr>
       <w:tab/>
-      <w:t>v1.1</w:t>
+      <w:t>v1.2</w:t>
       <w:tab/>
     </w:r>
     <w:r>

</xml_diff>

<commit_message>
docs: v1.3 — document the Timeline Reset button + Matrix label_below
DOC-02 User Manual: Reset button added to the Timeline scrubber controls table
and a note on PMBOK's Tools & Techniques band sitting under Inputs & Outputs.
DOC-01 Architecture: `label_below` zone-heading option in the config types, and
the Timeline Reset control in §8.2. DOC-02 summary deck gets a Reset bullet.
DOC-01/02 bumped to v1.3 (+ doc-control rows); README updated. DOC-03 unchanged
(no operational change). Regenerated the affected .docx/.pptx.

Co-Authored-By: Claude Opus 4.8 <noreply@anthropic.com>
</commit_message>
<xml_diff>
--- a/docs/01_Architecture_and_Design.docx
+++ b/docs/01_Architecture_and_Design.docx
@@ -165,7 +165,7 @@
                 <w:color w:val="1C2B3A"/>
                 <w:sz w:val="22"/>
               </w:rPr>
-              <w:t>v1.2</w:t>
+              <w:t>v1.3</w:t>
             </w:r>
           </w:p>
         </w:tc>
@@ -628,6 +628,96 @@
                 <w:sz w:val="20"/>
               </w:rPr>
               <w:t>PMBOK 6th ed added as the fourth framework; the hub-layer grid (config lifecycle_layer='hub') that renders PMBOK's 5×10 process matrix; four-service deployment.</w:t>
+            </w:r>
+          </w:p>
+        </w:tc>
+      </w:tr>
+      <w:tr>
+        <w:tc>
+          <w:tcPr>
+            <w:tcW w:type="dxa" w:w="2353"/>
+          </w:tcPr>
+          <w:p>
+            <w:r>
+              <w:rPr>
+                <w:rFonts w:ascii="Segoe UI" w:hAnsi="Segoe UI" w:cs="Segoe UI"/>
+                <w:b w:val="0"/>
+                <w:i w:val="0"/>
+                <w:color w:val="1C2B3A"/>
+                <w:sz w:val="20"/>
+              </w:rPr>
+              <w:t>v1.3</w:t>
+            </w:r>
+          </w:p>
+        </w:tc>
+        <w:tc>
+          <w:tcPr>
+            <w:tcW w:type="dxa" w:w="2353"/>
+          </w:tcPr>
+          <w:p>
+            <w:r>
+              <w:rPr>
+                <w:rFonts w:ascii="Segoe UI" w:hAnsi="Segoe UI" w:cs="Segoe UI"/>
+                <w:b w:val="0"/>
+                <w:i w:val="0"/>
+                <w:color w:val="1C2B3A"/>
+                <w:sz w:val="20"/>
+              </w:rPr>
+              <w:t>2026-08-02</w:t>
+            </w:r>
+          </w:p>
+        </w:tc>
+        <w:tc>
+          <w:tcPr>
+            <w:tcW w:type="dxa" w:w="2353"/>
+          </w:tcPr>
+          <w:p>
+            <w:r>
+              <w:rPr>
+                <w:rFonts w:ascii="Segoe UI" w:hAnsi="Segoe UI" w:cs="Segoe UI"/>
+                <w:b w:val="0"/>
+                <w:i w:val="0"/>
+                <w:color w:val="1C2B3A"/>
+                <w:sz w:val="20"/>
+              </w:rPr>
+              <w:t>Douglas Colvin</w:t>
+            </w:r>
+          </w:p>
+        </w:tc>
+        <w:tc>
+          <w:tcPr>
+            <w:tcW w:type="dxa" w:w="2353"/>
+          </w:tcPr>
+          <w:p>
+            <w:r>
+              <w:rPr>
+                <w:rFonts w:ascii="Segoe UI" w:hAnsi="Segoe UI" w:cs="Segoe UI"/>
+                <w:b w:val="0"/>
+                <w:i w:val="0"/>
+                <w:color w:val="1C2B3A"/>
+                <w:sz w:val="20"/>
+              </w:rPr>
+              <w:t xml:space="preserve">Documented the </w:t>
+            </w:r>
+            <w:r>
+              <w:rPr>
+                <w:rFonts w:ascii="Consolas" w:hAnsi="Consolas" w:cs="Consolas"/>
+                <w:b w:val="0"/>
+                <w:i w:val="0"/>
+                <w:color w:val="1B3F6E"/>
+                <w:sz w:val="19"/>
+              </w:rPr>
+              <w:t>label_below</w:t>
+            </w:r>
+            <w:r>
+              <w:rPr>
+                <w:rFonts w:ascii="Segoe UI" w:hAnsi="Segoe UI" w:cs="Segoe UI"/>
+                <w:b w:val="0"/>
+                <w:i w:val="0"/>
+                <w:color w:val="1C2B3A"/>
+                <w:sz w:val="20"/>
+              </w:rPr>
+              <w:t xml:space="preserve"> zone-heading option and the Timeline Reset control.</w:t>
             </w:r>
           </w:p>
         </w:tc>
@@ -3271,7 +3361,47 @@
           <w:color w:val="1C2B3A"/>
           <w:sz w:val="22"/>
         </w:rPr>
-        <w:t>;</w:t>
+        <w:t xml:space="preserve">. A </w:t>
+      </w:r>
+      <w:r>
+        <w:rPr>
+          <w:rFonts w:ascii="Consolas" w:hAnsi="Consolas" w:cs="Consolas"/>
+          <w:b w:val="0"/>
+          <w:i w:val="0"/>
+          <w:color w:val="1B3F6E"/>
+          <w:sz w:val="21"/>
+        </w:rPr>
+        <w:t>below</w:t>
+      </w:r>
+      <w:r>
+        <w:rPr>
+          <w:rFonts w:ascii="Segoe UI" w:hAnsi="Segoe UI" w:cs="Segoe UI"/>
+          <w:b w:val="0"/>
+          <w:i w:val="0"/>
+          <w:color w:val="1C2B3A"/>
+          <w:sz w:val="22"/>
+        </w:rPr>
+        <w:t xml:space="preserve">-zone type may set </w:t>
+      </w:r>
+      <w:r>
+        <w:rPr>
+          <w:rFonts w:ascii="Consolas" w:hAnsi="Consolas" w:cs="Consolas"/>
+          <w:b w:val="0"/>
+          <w:i w:val="0"/>
+          <w:color w:val="1B3F6E"/>
+          <w:sz w:val="21"/>
+        </w:rPr>
+        <w:t>label_below: true</w:t>
+      </w:r>
+      <w:r>
+        <w:rPr>
+          <w:rFonts w:ascii="Segoe UI" w:hAnsi="Segoe UI" w:cs="Segoe UI"/>
+          <w:b w:val="0"/>
+          <w:i w:val="0"/>
+          <w:color w:val="1C2B3A"/>
+          <w:sz w:val="22"/>
+        </w:rPr>
+        <w:t xml:space="preserve"> so its Matrix heading is drawn under the band rather than above it (PMBOK's Tools &amp; Techniques, so the spine stays centred);</w:t>
       </w:r>
     </w:p>
     <w:p>
@@ -6133,7 +6263,47 @@
           <w:color w:val="1C2B3A"/>
           <w:sz w:val="22"/>
         </w:rPr>
-        <w:t xml:space="preserve"> — echoes the Lifecycle view: processes in three swimlanes (Directing / Managing / Delivering) laid left→right by sequence; activities in each process's time-column; roles/practices/approaches/products as static resource bands below. A scrubber walks the lifecycle, lighting up each stage's sub-graph (spotlight or cumulative), with a play button.</w:t>
+        <w:t xml:space="preserve"> — echoes the Lifecycle view: processes in three swimlanes (Directing / Managing / Delivering) laid left→right by sequence; activities in each process's time-column; roles/practices/approaches/products as static resource bands below. A scrubber walks the lifecycle, lighting up each stage's sub-graph (spotlight or cumulative), with a play button and a </w:t>
+      </w:r>
+      <w:r>
+        <w:rPr>
+          <w:rFonts w:ascii="Segoe UI" w:hAnsi="Segoe UI" w:cs="Segoe UI"/>
+          <w:b/>
+          <w:i w:val="0"/>
+          <w:color w:val="1C2B3A"/>
+          <w:sz w:val="22"/>
+        </w:rPr>
+        <w:t>Reset</w:t>
+      </w:r>
+      <w:r>
+        <w:rPr>
+          <w:rFonts w:ascii="Segoe UI" w:hAnsi="Segoe UI" w:cs="Segoe UI"/>
+          <w:b w:val="0"/>
+          <w:i w:val="0"/>
+          <w:color w:val="1C2B3A"/>
+          <w:sz w:val="22"/>
+        </w:rPr>
+        <w:t xml:space="preserve"> control that clears the current node selection and the scrubber spotlight back to the full-strength view (clears </w:t>
+      </w:r>
+      <w:r>
+        <w:rPr>
+          <w:rFonts w:ascii="Consolas" w:hAnsi="Consolas" w:cs="Consolas"/>
+          <w:b w:val="0"/>
+          <w:i w:val="0"/>
+          <w:color w:val="1B3F6E"/>
+          <w:sz w:val="21"/>
+        </w:rPr>
+        <w:t>selectedId</w:t>
+      </w:r>
+      <w:r>
+        <w:rPr>
+          <w:rFonts w:ascii="Segoe UI" w:hAnsi="Segoe UI" w:cs="Segoe UI"/>
+          <w:b w:val="0"/>
+          <w:i w:val="0"/>
+          <w:color w:val="1C2B3A"/>
+          <w:sz w:val="22"/>
+        </w:rPr>
+        <w:t xml:space="preserve"> and resets the scrubber state).</w:t>
       </w:r>
     </w:p>
     <w:p>
@@ -8505,7 +8675,7 @@
         <w:sz w:val="16"/>
       </w:rPr>
       <w:tab/>
-      <w:t>v1.2</w:t>
+      <w:t>v1.3</w:t>
       <w:tab/>
     </w:r>
     <w:r>

</xml_diff>

<commit_message>
docs: DOC-01/02 v1.4, DOC-03 v1.3 — worked examples, fail-closed auth, CI/Sentry
Manuals regenerated to cover: every product linking its Helios worked-
example PDF across all four frameworks (MSP via five closest-match
approximations); ADMIN_PASSWORD now fail-closed (no default, unset =
read-only) replacing the stale change-me guidance; CI + Dependabot;
optional Sentry via SENTRY_DSN.

Co-Authored-By: Claude Fable 5 <noreply@anthropic.com>
</commit_message>
<xml_diff>
--- a/docs/01_Architecture_and_Design.docx
+++ b/docs/01_Architecture_and_Design.docx
@@ -165,7 +165,7 @@
                 <w:color w:val="1C2B3A"/>
                 <w:sz w:val="22"/>
               </w:rPr>
-              <w:t>v1.3</w:t>
+              <w:t>v1.4</w:t>
             </w:r>
           </w:p>
         </w:tc>
@@ -201,7 +201,7 @@
                 <w:color w:val="1C2B3A"/>
                 <w:sz w:val="22"/>
               </w:rPr>
-              <w:t>2 August 2026</w:t>
+              <w:t>6 August 2026</w:t>
             </w:r>
           </w:p>
         </w:tc>
@@ -718,6 +718,76 @@
                 <w:sz w:val="20"/>
               </w:rPr>
               <w:t xml:space="preserve"> zone-heading option and the Timeline Reset control.</w:t>
+            </w:r>
+          </w:p>
+        </w:tc>
+      </w:tr>
+      <w:tr>
+        <w:tc>
+          <w:tcPr>
+            <w:tcW w:type="dxa" w:w="2353"/>
+          </w:tcPr>
+          <w:p>
+            <w:r>
+              <w:rPr>
+                <w:rFonts w:ascii="Segoe UI" w:hAnsi="Segoe UI" w:cs="Segoe UI"/>
+                <w:b w:val="0"/>
+                <w:i w:val="0"/>
+                <w:color w:val="1C2B3A"/>
+                <w:sz w:val="20"/>
+              </w:rPr>
+              <w:t>v1.4</w:t>
+            </w:r>
+          </w:p>
+        </w:tc>
+        <w:tc>
+          <w:tcPr>
+            <w:tcW w:type="dxa" w:w="2353"/>
+          </w:tcPr>
+          <w:p>
+            <w:r>
+              <w:rPr>
+                <w:rFonts w:ascii="Segoe UI" w:hAnsi="Segoe UI" w:cs="Segoe UI"/>
+                <w:b w:val="0"/>
+                <w:i w:val="0"/>
+                <w:color w:val="1C2B3A"/>
+                <w:sz w:val="20"/>
+              </w:rPr>
+              <w:t>2026-08-06</w:t>
+            </w:r>
+          </w:p>
+        </w:tc>
+        <w:tc>
+          <w:tcPr>
+            <w:tcW w:type="dxa" w:w="2353"/>
+          </w:tcPr>
+          <w:p>
+            <w:r>
+              <w:rPr>
+                <w:rFonts w:ascii="Segoe UI" w:hAnsi="Segoe UI" w:cs="Segoe UI"/>
+                <w:b w:val="0"/>
+                <w:i w:val="0"/>
+                <w:color w:val="1C2B3A"/>
+                <w:sz w:val="20"/>
+              </w:rPr>
+              <w:t>Douglas Colvin</w:t>
+            </w:r>
+          </w:p>
+        </w:tc>
+        <w:tc>
+          <w:tcPr>
+            <w:tcW w:type="dxa" w:w="2353"/>
+          </w:tcPr>
+          <w:p>
+            <w:r>
+              <w:rPr>
+                <w:rFonts w:ascii="Segoe UI" w:hAnsi="Segoe UI" w:cs="Segoe UI"/>
+                <w:b w:val="0"/>
+                <w:i w:val="0"/>
+                <w:color w:val="1C2B3A"/>
+                <w:sz w:val="20"/>
+              </w:rPr>
+              <w:t>Worked-example wiring: every product across all four frameworks links its Helios PDF (MSP uses five closest-match approximations); fail-closed admin auth (no default password; unset means read-only); CI + Dependabot; optional Sentry.</w:t>
             </w:r>
           </w:p>
         </w:tc>
@@ -6968,7 +7038,27 @@
           <w:color w:val="1C2B3A"/>
           <w:sz w:val="22"/>
         </w:rPr>
-        <w:t xml:space="preserve"> environment variable. This is a deliberate, lightweight gate — enough to stop casual edits, not a full account system.</w:t>
+        <w:t xml:space="preserve"> environment variable — </w:t>
+      </w:r>
+      <w:r>
+        <w:rPr>
+          <w:rFonts w:ascii="Segoe UI" w:hAnsi="Segoe UI" w:cs="Segoe UI"/>
+          <w:b/>
+          <w:i w:val="0"/>
+          <w:color w:val="1C2B3A"/>
+          <w:sz w:val="22"/>
+        </w:rPr>
+        <w:t>fail-closed</w:t>
+      </w:r>
+      <w:r>
+        <w:rPr>
+          <w:rFonts w:ascii="Segoe UI" w:hAnsi="Segoe UI" w:cs="Segoe UI"/>
+          <w:b w:val="0"/>
+          <w:i w:val="0"/>
+          <w:color w:val="1C2B3A"/>
+          <w:sz w:val="22"/>
+        </w:rPr>
+        <w:t>: if the variable is unset the service is read-only and no password (including old defaults) is accepted. This is a deliberate, lightweight gate — enough to stop casual edits, not a full account system.</w:t>
       </w:r>
     </w:p>
     <w:tbl>
@@ -8675,7 +8765,7 @@
         <w:sz w:val="16"/>
       </w:rPr>
       <w:tab/>
-      <w:t>v1.3</w:t>
+      <w:t>v1.4</w:t>
       <w:tab/>
     </w:r>
     <w:r>

</xml_diff>